<commit_message>
feat: Update CV synthetic profile with validated Option 3 (Consultant IA & Lead AI Engineer)
</commit_message>
<xml_diff>
--- a/KOA_MARIE_GERVAIS_NELLY_CV.docx
+++ b/KOA_MARIE_GERVAIS_NELLY_CV.docx
@@ -17,19 +17,19 @@
         </w:tblBorders>
       </w:tblPr>
       <w:tblGrid>
-        <w:gridCol w:w="5760"/>
-        <w:gridCol w:w="5760"/>
+        <w:gridCol w:w="5688"/>
+        <w:gridCol w:w="5688"/>
       </w:tblGrid>
       <w:tr>
         <w:tc>
           <w:tcPr>
-            <w:tcW w:type="dxa" w:w="3456"/>
+            <w:tcW w:type="dxa" w:w="3600"/>
             <w:shd w:fill="0F172A"/>
             <w:tcMar>
-              <w:top w:w="120" w:type="dxa"/>
-              <w:bottom w:w="120" w:type="dxa"/>
-              <w:left w:w="140" w:type="dxa"/>
-              <w:right w:w="140" w:type="dxa"/>
+              <w:top w:w="180" w:type="dxa"/>
+              <w:bottom w:w="180" w:type="dxa"/>
+              <w:left w:w="180" w:type="dxa"/>
+              <w:right w:w="180" w:type="dxa"/>
             </w:tcMar>
           </w:tcPr>
           <w:p/>
@@ -40,18 +40,18 @@
               <w:tblLook w:firstColumn="1" w:firstRow="1" w:lastColumn="0" w:lastRow="0" w:noHBand="0" w:noVBand="1" w:val="04A0"/>
             </w:tblPr>
             <w:tblGrid>
-              <w:gridCol w:w="3456"/>
+              <w:gridCol w:w="3600"/>
             </w:tblGrid>
             <w:tr>
               <w:tc>
                 <w:tcPr>
-                  <w:tcW w:type="dxa" w:w="2304"/>
+                  <w:tcW w:type="dxa" w:w="2592"/>
                   <w:shd w:fill="1E293B"/>
                   <w:tcMar>
-                    <w:top w:w="140" w:type="dxa"/>
-                    <w:bottom w:w="140" w:type="dxa"/>
-                    <w:left w:w="80" w:type="dxa"/>
-                    <w:right w:w="80" w:type="dxa"/>
+                    <w:top w:w="200" w:type="dxa"/>
+                    <w:bottom w:w="200" w:type="dxa"/>
+                    <w:left w:w="100" w:type="dxa"/>
+                    <w:right w:w="100" w:type="dxa"/>
                   </w:tcMar>
                 </w:tcPr>
                 <w:p>
@@ -64,9 +64,9 @@
                       <w:color w:val="38BDF8"/>
                       <w:sz w:val="15"/>
                     </w:rPr>
-                    <w:t>📷 PHOTO CV</w:t>
+                    <w:t>📷 EMPLACEMENT PHOTO CV</w:t>
                     <w:br/>
-                    <w:t>(Insérer photo)</w:t>
+                    <w:t>(Insérer votre photo ici)</w:t>
                   </w:r>
                 </w:p>
               </w:tc>
@@ -75,386 +75,365 @@
           <w:p/>
           <w:p>
             <w:pPr>
-              <w:spacing w:before="120" w:after="40"/>
+              <w:spacing w:after="80"/>
+            </w:pPr>
+          </w:p>
+          <w:p>
+            <w:pPr>
+              <w:spacing w:before="160" w:after="60"/>
             </w:pPr>
             <w:r>
               <w:rPr>
                 <w:rFonts w:ascii="Segoe UI Semibold" w:hAnsi="Segoe UI Semibold"/>
                 <w:b/>
                 <w:color w:val="38BDF8"/>
-                <w:sz w:val="18"/>
+                <w:sz w:val="20"/>
               </w:rPr>
               <w:t>CONTACT</w:t>
             </w:r>
           </w:p>
           <w:p>
             <w:pPr>
-              <w:spacing w:before="0" w:after="30" w:line="252" w:lineRule="auto"/>
+              <w:spacing w:before="0" w:after="50" w:line="276" w:lineRule="auto"/>
             </w:pPr>
             <w:r>
               <w:rPr>
                 <w:color w:val="F8FAFC"/>
-                <w:sz w:val="16"/>
+                <w:sz w:val="17"/>
               </w:rPr>
               <w:t>✉  koagervais85@gmail.com</w:t>
             </w:r>
           </w:p>
           <w:p>
             <w:pPr>
-              <w:spacing w:before="0" w:after="30" w:line="252" w:lineRule="auto"/>
+              <w:spacing w:before="0" w:after="50" w:line="276" w:lineRule="auto"/>
             </w:pPr>
             <w:r>
               <w:rPr>
                 <w:color w:val="F8FAFC"/>
-                <w:sz w:val="16"/>
+                <w:sz w:val="17"/>
               </w:rPr>
               <w:t>✆  +237 695 35 34 02</w:t>
             </w:r>
           </w:p>
           <w:p>
             <w:pPr>
-              <w:spacing w:before="0" w:after="30" w:line="252" w:lineRule="auto"/>
+              <w:spacing w:before="0" w:after="50" w:line="276" w:lineRule="auto"/>
             </w:pPr>
             <w:r>
               <w:rPr>
                 <w:color w:val="F8FAFC"/>
-                <w:sz w:val="16"/>
+                <w:sz w:val="17"/>
               </w:rPr>
-              <w:t>⌂  Douala / Ngaoundéré</w:t>
+              <w:t>⌂  Douala / Ngaoundéré, Cameroun</w:t>
             </w:r>
           </w:p>
           <w:p>
             <w:pPr>
-              <w:spacing w:before="0" w:after="30" w:line="252" w:lineRule="auto"/>
+              <w:spacing w:before="0" w:after="50" w:line="276" w:lineRule="auto"/>
             </w:pPr>
             <w:r>
               <w:rPr>
                 <w:color w:val="F8FAFC"/>
-                <w:sz w:val="16"/>
+                <w:sz w:val="17"/>
               </w:rPr>
               <w:t>🌐  github.com/gervais-afk</w:t>
             </w:r>
           </w:p>
           <w:p>
             <w:pPr>
-              <w:spacing w:before="120" w:after="40"/>
+              <w:spacing w:before="160" w:after="60"/>
             </w:pPr>
             <w:r>
               <w:rPr>
                 <w:rFonts w:ascii="Segoe UI Semibold" w:hAnsi="Segoe UI Semibold"/>
                 <w:b/>
                 <w:color w:val="38BDF8"/>
-                <w:sz w:val="18"/>
+                <w:sz w:val="20"/>
               </w:rPr>
               <w:t>COMPÉTENCES &amp; OUTILS</w:t>
             </w:r>
           </w:p>
           <w:p>
             <w:pPr>
-              <w:spacing w:before="0" w:after="30" w:line="252" w:lineRule="auto"/>
+              <w:spacing w:before="0" w:after="50" w:line="276" w:lineRule="auto"/>
             </w:pPr>
             <w:r>
               <w:rPr>
                 <w:color w:val="F8FAFC"/>
-                <w:sz w:val="16"/>
+                <w:sz w:val="17"/>
               </w:rPr>
-              <w:t>Gemma 4 / Gemini   ■ ■ ■ ■ ■</w:t>
+              <w:t>Google Gemma 4 / Gemini   ■ ■ ■ ■ ■</w:t>
             </w:r>
           </w:p>
           <w:p>
             <w:pPr>
-              <w:spacing w:before="0" w:after="30" w:line="252" w:lineRule="auto"/>
+              <w:spacing w:before="0" w:after="50" w:line="276" w:lineRule="auto"/>
             </w:pPr>
             <w:r>
               <w:rPr>
                 <w:color w:val="F8FAFC"/>
-                <w:sz w:val="16"/>
+                <w:sz w:val="17"/>
               </w:rPr>
-              <w:t>Neo4j GraphRAG (N10S) ■ ■ ■ ■ ■</w:t>
+              <w:t>Neo4j GraphRAG (N10S)    ■ ■ ■ ■ ■</w:t>
             </w:r>
           </w:p>
           <w:p>
             <w:pPr>
-              <w:spacing w:before="0" w:after="30" w:line="252" w:lineRule="auto"/>
+              <w:spacing w:before="0" w:after="50" w:line="276" w:lineRule="auto"/>
             </w:pPr>
             <w:r>
               <w:rPr>
                 <w:color w:val="F8FAFC"/>
-                <w:sz w:val="16"/>
+                <w:sz w:val="17"/>
               </w:rPr>
-              <w:t>Firebase Genkit / RAG  ■ ■ ■ ■ ■</w:t>
+              <w:t>Firebase Genkit / RAG     ■ ■ ■ ■ ■</w:t>
             </w:r>
           </w:p>
           <w:p>
             <w:pPr>
-              <w:spacing w:before="0" w:after="30" w:line="252" w:lineRule="auto"/>
+              <w:spacing w:before="0" w:after="50" w:line="276" w:lineRule="auto"/>
             </w:pPr>
             <w:r>
               <w:rPr>
                 <w:color w:val="F8FAFC"/>
-                <w:sz w:val="16"/>
+                <w:sz w:val="17"/>
               </w:rPr>
-              <w:t>Python (BAEL 91)       ■ ■ ■ ■ ■</w:t>
+              <w:t>Python (BAEL 91 Sandbox)  ■ ■ ■ ■ ■</w:t>
             </w:r>
           </w:p>
           <w:p>
             <w:pPr>
-              <w:spacing w:before="0" w:after="30" w:line="252" w:lineRule="auto"/>
+              <w:spacing w:before="0" w:after="50" w:line="276" w:lineRule="auto"/>
             </w:pPr>
             <w:r>
               <w:rPr>
                 <w:color w:val="F8FAFC"/>
-                <w:sz w:val="16"/>
+                <w:sz w:val="17"/>
               </w:rPr>
-              <w:t>IfcOpenShell (5D BIM)  ■ ■ ■ ■ □</w:t>
+              <w:t>IfcOpenShell (5D BIM)     ■ ■ ■ ■ □</w:t>
             </w:r>
           </w:p>
           <w:p>
             <w:pPr>
-              <w:spacing w:before="0" w:after="30" w:line="252" w:lineRule="auto"/>
+              <w:spacing w:before="0" w:after="50" w:line="276" w:lineRule="auto"/>
             </w:pPr>
             <w:r>
               <w:rPr>
                 <w:color w:val="F8FAFC"/>
-                <w:sz w:val="16"/>
+                <w:sz w:val="17"/>
               </w:rPr>
-              <w:t>PostgreSQL / SQL      ■ ■ ■ ■ ■</w:t>
+              <w:t>PostgreSQL / SQL         ■ ■ ■ ■ ■</w:t>
             </w:r>
           </w:p>
           <w:p>
             <w:pPr>
-              <w:spacing w:before="0" w:after="30" w:line="252" w:lineRule="auto"/>
+              <w:spacing w:before="0" w:after="50" w:line="276" w:lineRule="auto"/>
             </w:pPr>
             <w:r>
               <w:rPr>
                 <w:color w:val="F8FAFC"/>
-                <w:sz w:val="16"/>
+                <w:sz w:val="17"/>
               </w:rPr>
-              <w:t>Next.js 14 / React     ■ ■ ■ ■ □</w:t>
+              <w:t>Next.js 14 / React        ■ ■ ■ ■ □</w:t>
             </w:r>
           </w:p>
           <w:p>
             <w:pPr>
-              <w:spacing w:before="0" w:after="30" w:line="252" w:lineRule="auto"/>
+              <w:spacing w:before="0" w:after="50" w:line="276" w:lineRule="auto"/>
             </w:pPr>
             <w:r>
               <w:rPr>
                 <w:color w:val="F8FAFC"/>
-                <w:sz w:val="16"/>
+                <w:sz w:val="17"/>
               </w:rPr>
-              <w:t>FastAPI / Streamlit    ■ ■ ■ ■ ■</w:t>
+              <w:t>FastAPI / Node.js         ■ ■ ■ ■ □</w:t>
             </w:r>
           </w:p>
           <w:p>
             <w:pPr>
-              <w:spacing w:before="0" w:after="30" w:line="252" w:lineRule="auto"/>
+              <w:spacing w:before="0" w:after="50" w:line="276" w:lineRule="auto"/>
             </w:pPr>
             <w:r>
               <w:rPr>
                 <w:color w:val="F8FAFC"/>
-                <w:sz w:val="16"/>
+                <w:sz w:val="17"/>
               </w:rPr>
-              <w:t>MLflow (MLOps)/Docker  ■ ■ ■ ■ □</w:t>
+              <w:t>Streamlit / PWA ML        ■ ■ ■ ■ ■</w:t>
             </w:r>
           </w:p>
           <w:p>
             <w:pPr>
-              <w:spacing w:before="120" w:after="40"/>
+              <w:spacing w:before="0" w:after="50" w:line="276" w:lineRule="auto"/>
+            </w:pPr>
+            <w:r>
+              <w:rPr>
+                <w:color w:val="F8FAFC"/>
+                <w:sz w:val="17"/>
+              </w:rPr>
+              <w:t>MLflow (MLOps) / Docker   ■ ■ ■ ■ □</w:t>
+            </w:r>
+          </w:p>
+          <w:p>
+            <w:pPr>
+              <w:spacing w:before="160" w:after="60"/>
             </w:pPr>
             <w:r>
               <w:rPr>
                 <w:rFonts w:ascii="Segoe UI Semibold" w:hAnsi="Segoe UI Semibold"/>
                 <w:b/>
                 <w:color w:val="38BDF8"/>
-                <w:sz w:val="18"/>
+                <w:sz w:val="20"/>
               </w:rPr>
               <w:t>LANGUES</w:t>
             </w:r>
           </w:p>
           <w:p>
             <w:pPr>
-              <w:spacing w:before="0" w:after="30" w:line="252" w:lineRule="auto"/>
+              <w:spacing w:before="0" w:after="50" w:line="276" w:lineRule="auto"/>
             </w:pPr>
             <w:r>
               <w:rPr>
                 <w:color w:val="F8FAFC"/>
-                <w:sz w:val="16"/>
+                <w:sz w:val="17"/>
               </w:rPr>
               <w:t>Français   ■ ■ ■ ■ ■  (Courant)</w:t>
             </w:r>
           </w:p>
           <w:p>
             <w:pPr>
-              <w:spacing w:before="0" w:after="30" w:line="252" w:lineRule="auto"/>
+              <w:spacing w:before="0" w:after="50" w:line="276" w:lineRule="auto"/>
             </w:pPr>
             <w:r>
               <w:rPr>
                 <w:color w:val="F8FAFC"/>
-                <w:sz w:val="16"/>
+                <w:sz w:val="17"/>
               </w:rPr>
-              <w:t>Anglais    ■ ■ ■ ■ □  (Pro/Tech)</w:t>
+              <w:t>Anglais    ■ ■ ■ ■ □  (Pro / Tech)</w:t>
             </w:r>
           </w:p>
           <w:p>
             <w:pPr>
-              <w:spacing w:before="120" w:after="40"/>
+              <w:spacing w:before="160" w:after="60"/>
             </w:pPr>
             <w:r>
               <w:rPr>
                 <w:rFonts w:ascii="Segoe UI Semibold" w:hAnsi="Segoe UI Semibold"/>
                 <w:b/>
                 <w:color w:val="38BDF8"/>
-                <w:sz w:val="18"/>
+                <w:sz w:val="20"/>
               </w:rPr>
               <w:t>ATOUTS CLÉS</w:t>
             </w:r>
           </w:p>
           <w:p>
             <w:pPr>
-              <w:spacing w:before="0" w:after="30" w:line="252" w:lineRule="auto"/>
+              <w:spacing w:before="0" w:after="50" w:line="276" w:lineRule="auto"/>
             </w:pPr>
             <w:r>
               <w:rPr>
                 <w:color w:val="F8FAFC"/>
-                <w:sz w:val="16"/>
+                <w:sz w:val="17"/>
               </w:rPr>
-              <w:t>◈ Double compétence IA &amp; Génie Civil</w:t>
+              <w:t>◈  Double compétence IA &amp; Génie Civil</w:t>
             </w:r>
           </w:p>
           <w:p>
             <w:pPr>
-              <w:spacing w:before="0" w:after="30" w:line="252" w:lineRule="auto"/>
+              <w:spacing w:before="0" w:after="50" w:line="276" w:lineRule="auto"/>
             </w:pPr>
             <w:r>
               <w:rPr>
                 <w:color w:val="F8FAFC"/>
-                <w:sz w:val="16"/>
+                <w:sz w:val="17"/>
               </w:rPr>
-              <w:t>◈ Gestion risques &amp; Sûreté AVSEC</w:t>
+              <w:t>◈  Gestion des risques &amp; Sécurité (AVSEC)</w:t>
             </w:r>
           </w:p>
           <w:p>
             <w:pPr>
-              <w:spacing w:before="0" w:after="30" w:line="252" w:lineRule="auto"/>
+              <w:spacing w:before="0" w:after="50" w:line="276" w:lineRule="auto"/>
             </w:pPr>
             <w:r>
               <w:rPr>
                 <w:color w:val="F8FAFC"/>
-                <w:sz w:val="16"/>
+                <w:sz w:val="17"/>
               </w:rPr>
-              <w:t>◈ Guardrails IA &amp; Calculs Sandbox</w:t>
+              <w:t>◈  Guardrails IA &amp; Calculs déterministes</w:t>
             </w:r>
           </w:p>
           <w:p>
             <w:pPr>
-              <w:spacing w:before="0" w:after="30" w:line="252" w:lineRule="auto"/>
+              <w:spacing w:before="0" w:after="50" w:line="276" w:lineRule="auto"/>
             </w:pPr>
             <w:r>
               <w:rPr>
                 <w:color w:val="F8FAFC"/>
-                <w:sz w:val="16"/>
+                <w:sz w:val="17"/>
               </w:rPr>
-              <w:t>◈ Rigueur &amp; Souveraineté IA</w:t>
-            </w:r>
-          </w:p>
-          <w:p>
-            <w:pPr>
-              <w:spacing w:before="120" w:after="40"/>
-            </w:pPr>
-            <w:r>
-              <w:rPr>
-                <w:rFonts w:ascii="Segoe UI Semibold" w:hAnsi="Segoe UI Semibold"/>
-                <w:b/>
-                <w:color w:val="38BDF8"/>
-                <w:sz w:val="18"/>
-              </w:rPr>
-              <w:t>ENGAGEMENT</w:t>
-            </w:r>
-          </w:p>
-          <w:p>
-            <w:pPr>
-              <w:spacing w:before="0" w:after="30" w:line="252" w:lineRule="auto"/>
-            </w:pPr>
-            <w:r>
-              <w:rPr>
-                <w:color w:val="F8FAFC"/>
-                <w:sz w:val="16"/>
-              </w:rPr>
-              <w:t>◦ Statut : Disponible / Conseil</w:t>
-            </w:r>
-          </w:p>
-          <w:p>
-            <w:pPr>
-              <w:spacing w:before="0" w:after="30" w:line="252" w:lineRule="auto"/>
-            </w:pPr>
-            <w:r>
-              <w:rPr>
-                <w:color w:val="F8FAFC"/>
-                <w:sz w:val="16"/>
-              </w:rPr>
-              <w:t>◦ Mobilité : Remote / Intl</w:t>
+              <w:t>◈  Rigueur &amp; Souveraineté logicielle</w:t>
             </w:r>
           </w:p>
         </w:tc>
         <w:tc>
           <w:tcPr>
-            <w:tcW w:type="dxa" w:w="7344"/>
+            <w:tcW w:type="dxa" w:w="7056"/>
             <w:shd w:fill="FFFFFF"/>
             <w:tcMar>
-              <w:top w:w="120" w:type="dxa"/>
-              <w:bottom w:w="120" w:type="dxa"/>
-              <w:left w:w="160" w:type="dxa"/>
-              <w:right w:w="120" w:type="dxa"/>
+              <w:top w:w="180" w:type="dxa"/>
+              <w:bottom w:w="180" w:type="dxa"/>
+              <w:left w:w="200" w:type="dxa"/>
+              <w:right w:w="180" w:type="dxa"/>
             </w:tcMar>
           </w:tcPr>
           <w:p>
             <w:pPr>
-              <w:spacing w:before="0" w:after="20"/>
+              <w:spacing w:before="0" w:after="40"/>
             </w:pPr>
             <w:r>
               <w:rPr>
                 <w:rFonts w:ascii="Segoe UI" w:hAnsi="Segoe UI"/>
                 <w:b/>
                 <w:color w:val="0A1128"/>
-                <w:sz w:val="32"/>
+                <w:sz w:val="36"/>
               </w:rPr>
               <w:t>KOA MARIE GERVAIS NELLY</w:t>
             </w:r>
           </w:p>
           <w:p>
             <w:pPr>
-              <w:spacing w:before="0" w:after="40"/>
+              <w:spacing w:before="0" w:after="60"/>
             </w:pPr>
             <w:r>
               <w:rPr>
                 <w:b/>
                 <w:color w:val="0284C7"/>
-                <w:sz w:val="18"/>
+                <w:sz w:val="20"/>
               </w:rPr>
               <w:t>Lead AI Engineer &amp; Consultant IA / Data   │   Fondateur @ Archi Cam AI</w:t>
             </w:r>
           </w:p>
           <w:p>
             <w:pPr>
-              <w:spacing w:before="0" w:after="80"/>
+              <w:spacing w:before="0" w:after="120"/>
             </w:pPr>
             <w:r>
               <w:rPr>
                 <w:color w:val="0284C7"/>
-                <w:sz w:val="15"/>
+                <w:sz w:val="16"/>
               </w:rPr>
               <w:t>─── ◈ ────────────────────────────────────────────────── ◈ ───</w:t>
             </w:r>
           </w:p>
           <w:p>
             <w:pPr>
-              <w:spacing w:before="120" w:after="40"/>
+              <w:spacing w:before="200" w:after="80"/>
             </w:pPr>
             <w:r>
               <w:rPr>
                 <w:b/>
                 <w:color w:val="0284C7"/>
-                <w:sz w:val="18"/>
+                <w:sz w:val="20"/>
               </w:rPr>
               <w:t xml:space="preserve">◈  </w:t>
             </w:r>
@@ -463,32 +442,32 @@
                 <w:rFonts w:ascii="Segoe UI" w:hAnsi="Segoe UI"/>
                 <w:b/>
                 <w:color w:val="0A1128"/>
-                <w:sz w:val="19"/>
+                <w:sz w:val="21"/>
               </w:rPr>
               <w:t>PROFIL SYNTHÉTIQUE</w:t>
             </w:r>
           </w:p>
           <w:p>
             <w:pPr>
-              <w:spacing w:before="0" w:after="80" w:line="259" w:lineRule="auto"/>
+              <w:spacing w:before="0" w:after="120" w:line="276" w:lineRule="auto"/>
             </w:pPr>
             <w:r>
               <w:rPr>
                 <w:color w:val="334155"/>
-                <w:sz w:val="17"/>
+                <w:sz w:val="18"/>
               </w:rPr>
-              <w:t>Ingénieur &amp; Spécialiste en IA Appliquée alliant la rigueur du Génie Civil et l'expertise en Sûreté Opérationnelle à la maîtrise des architectures d'IA Générative, GraphRAG (Neo4j) et MLOps. Fondateur d'Archi Cam AI (projet développé pour le Google Africa Applied AI Lab). Concepteur de solutions IA souveraines d'entreprise éliminant les hallucinations LLM par des moteurs déterministes Sandbox.</w:t>
+              <w:t>Consultant IA &amp; Lead AI Engineer, j'accompagne les entreprises dans la transformation de leurs données complexes en leviers décisionnels à forte valeur ajoutée. Spécialiste des Agents IA autonomes, du GraphRAG (Neo4j N10S) et de la Business Intelligence sécurisée (Sovereign.BI), je développe des solutions d'IA souveraines, étanches et explicables (audits SHAP). Fondateur d'Archi Cam AI pour le Google Africa Applied AI Lab, j'allie méthodologie d'ingénieur et vision produit.</w:t>
             </w:r>
           </w:p>
           <w:p>
             <w:pPr>
-              <w:spacing w:before="120" w:after="40"/>
+              <w:spacing w:before="200" w:after="80"/>
             </w:pPr>
             <w:r>
               <w:rPr>
                 <w:b/>
                 <w:color w:val="0284C7"/>
-                <w:sz w:val="18"/>
+                <w:sz w:val="20"/>
               </w:rPr>
               <w:t xml:space="preserve">◈  </w:t>
             </w:r>
@@ -497,20 +476,20 @@
                 <w:rFonts w:ascii="Segoe UI" w:hAnsi="Segoe UI"/>
                 <w:b/>
                 <w:color w:val="0A1128"/>
-                <w:sz w:val="19"/>
+                <w:sz w:val="21"/>
               </w:rPr>
               <w:t>PROJETS IA MAJEURS &amp; RÉALISATIONS</w:t>
             </w:r>
           </w:p>
           <w:p>
             <w:pPr>
-              <w:spacing w:before="60" w:after="20"/>
+              <w:spacing w:before="80" w:after="20"/>
             </w:pPr>
             <w:r>
               <w:rPr>
                 <w:b/>
                 <w:color w:val="0A1128"/>
-                <w:sz w:val="18"/>
+                <w:sz w:val="19"/>
               </w:rPr>
               <w:t xml:space="preserve">Archi Cam AI 🏛️  </w:t>
             </w:r>
@@ -518,15 +497,15 @@
               <w:rPr>
                 <w:i/>
                 <w:color w:val="0284C7"/>
-                <w:sz w:val="16"/>
+                <w:sz w:val="17"/>
               </w:rPr>
               <w:t>–  SaaS IA Agentique &amp; 5D BIM (Candidature Google Africa Applied AI Lab)</w:t>
             </w:r>
           </w:p>
           <w:p>
             <w:pPr>
-              <w:spacing w:before="0" w:after="20"/>
-              <w:ind w:left="144"/>
+              <w:spacing w:before="0" w:after="30"/>
+              <w:ind w:left="173"/>
             </w:pPr>
             <w:r>
               <w:rPr>
@@ -538,15 +517,15 @@
             <w:r>
               <w:rPr>
                 <w:color w:val="334155"/>
-                <w:sz w:val="16"/>
+                <w:sz w:val="17"/>
               </w:rPr>
-              <w:t>Plateforme IA souveraine de modélisation BIM 5D et devis BTP normés (BAEL 91 / Eurocodes).</w:t>
+              <w:t>Plateforme IA souveraine de modélisation BIM 5D et génération automatisée de devis BTP normés (BAEL 91 / Eurocodes).</w:t>
             </w:r>
           </w:p>
           <w:p>
             <w:pPr>
-              <w:spacing w:before="0" w:after="20"/>
-              <w:ind w:left="144"/>
+              <w:spacing w:before="0" w:after="30"/>
+              <w:ind w:left="173"/>
             </w:pPr>
             <w:r>
               <w:rPr>
@@ -558,15 +537,15 @@
             <w:r>
               <w:rPr>
                 <w:color w:val="334155"/>
-                <w:sz w:val="16"/>
+                <w:sz w:val="17"/>
               </w:rPr>
-              <w:t>Moteur hybride Google Gemma 4 12B local + Gemini 1.5 Pro + Python Sandbox (IfcOpenShell).</w:t>
+              <w:t>Combinaison de Google Gemma 4 12B local, Gemini 1.5 Pro Vision et d'un moteur Python Sandbox (IfcOpenShell, BAEL 91).</w:t>
             </w:r>
           </w:p>
           <w:p>
             <w:pPr>
-              <w:spacing w:before="0" w:after="20"/>
-              <w:ind w:left="144"/>
+              <w:spacing w:before="0" w:after="30"/>
+              <w:ind w:left="173"/>
             </w:pPr>
             <w:r>
               <w:rPr>
@@ -578,20 +557,20 @@
             <w:r>
               <w:rPr>
                 <w:color w:val="334155"/>
-                <w:sz w:val="16"/>
+                <w:sz w:val="17"/>
               </w:rPr>
               <w:t>Génération de devis Excel (DQE) en &lt; 2 min et rendus HD via Imagen 3 + ControlNet.</w:t>
             </w:r>
           </w:p>
           <w:p>
             <w:pPr>
-              <w:spacing w:before="60" w:after="20"/>
+              <w:spacing w:before="80" w:after="20"/>
             </w:pPr>
             <w:r>
               <w:rPr>
                 <w:b/>
                 <w:color w:val="0A1128"/>
-                <w:sz w:val="18"/>
+                <w:sz w:val="19"/>
               </w:rPr>
               <w:t xml:space="preserve">Sovereign.BI Agentic 📊  </w:t>
             </w:r>
@@ -599,15 +578,15 @@
               <w:rPr>
                 <w:i/>
                 <w:color w:val="0284C7"/>
-                <w:sz w:val="16"/>
+                <w:sz w:val="17"/>
               </w:rPr>
               <w:t>–  Business Intelligence Agentique &amp; Guardrails</w:t>
             </w:r>
           </w:p>
           <w:p>
             <w:pPr>
-              <w:spacing w:before="0" w:after="20"/>
-              <w:ind w:left="144"/>
+              <w:spacing w:before="0" w:after="30"/>
+              <w:ind w:left="173"/>
             </w:pPr>
             <w:r>
               <w:rPr>
@@ -619,15 +598,15 @@
             <w:r>
               <w:rPr>
                 <w:color w:val="334155"/>
-                <w:sz w:val="16"/>
+                <w:sz w:val="17"/>
               </w:rPr>
-              <w:t>Moteur décisionnel d'interrogation de bases SQL en langage naturel (React, FastAPI, PostgreSQL).</w:t>
+              <w:t>Moteur décisionnel autonome d'interrogation de bases SQL complexes en langage naturel (React, FastAPI, PostgreSQL).</w:t>
             </w:r>
           </w:p>
           <w:p>
             <w:pPr>
-              <w:spacing w:before="0" w:after="20"/>
-              <w:ind w:left="144"/>
+              <w:spacing w:before="0" w:after="30"/>
+              <w:ind w:left="173"/>
             </w:pPr>
             <w:r>
               <w:rPr>
@@ -639,20 +618,20 @@
             <w:r>
               <w:rPr>
                 <w:color w:val="334155"/>
-                <w:sz w:val="16"/>
+                <w:sz w:val="17"/>
               </w:rPr>
-              <w:t>Orchestrateur TypeScript, Neo4j N10S (GraphRAG) et auditeur d'explicabilité SHAP Sentinel.</w:t>
+              <w:t>Architecture TypeScript Orchestrator, Neo4j N10S (GraphRAG) et auditeur d'explicabilité SHAP Sentinel.</w:t>
             </w:r>
           </w:p>
           <w:p>
             <w:pPr>
-              <w:spacing w:before="60" w:after="20"/>
+              <w:spacing w:before="80" w:after="20"/>
             </w:pPr>
             <w:r>
               <w:rPr>
                 <w:b/>
                 <w:color w:val="0A1128"/>
-                <w:sz w:val="18"/>
+                <w:sz w:val="19"/>
               </w:rPr>
               <w:t xml:space="preserve">Dataset Automator ⚙️ &amp; VigieSahel 🌾  </w:t>
             </w:r>
@@ -660,15 +639,15 @@
               <w:rPr>
                 <w:i/>
                 <w:color w:val="0284C7"/>
-                <w:sz w:val="16"/>
+                <w:sz w:val="17"/>
               </w:rPr>
               <w:t>–  MLOps &amp; IA Impact Climat / Santé</w:t>
             </w:r>
           </w:p>
           <w:p>
             <w:pPr>
-              <w:spacing w:before="0" w:after="20"/>
-              <w:ind w:left="144"/>
+              <w:spacing w:before="0" w:after="30"/>
+              <w:ind w:left="173"/>
             </w:pPr>
             <w:r>
               <w:rPr>
@@ -680,15 +659,15 @@
             <w:r>
               <w:rPr>
                 <w:color w:val="334155"/>
-                <w:sz w:val="16"/>
+                <w:sz w:val="17"/>
               </w:rPr>
-              <w:t>Dataset Automator : Pipeline RAG d'évaluation séries temporelles (Neo4j, MLflow, Genkit, Gemma-2).</w:t>
+              <w:t>Dataset Automator : Pipeline RAG d'évaluation de séries temporelles (Neo4j, MLflow, Genkit, Gemma-2).</w:t>
             </w:r>
           </w:p>
           <w:p>
             <w:pPr>
-              <w:spacing w:before="0" w:after="20"/>
-              <w:ind w:left="144"/>
+              <w:spacing w:before="0" w:after="30"/>
+              <w:ind w:left="173"/>
             </w:pPr>
             <w:r>
               <w:rPr>
@@ -700,20 +679,152 @@
             <w:r>
               <w:rPr>
                 <w:color w:val="334155"/>
-                <w:sz w:val="16"/>
+                <w:sz w:val="17"/>
               </w:rPr>
               <w:t>VigieSahel : Plateforme prédictive des semis agricoles et suivi PM2.5 / méningite (Streamlit, Supabase, ML).</w:t>
             </w:r>
           </w:p>
+        </w:tc>
+      </w:tr>
+      <w:tr>
+        <w:tc>
+          <w:tcPr>
+            <w:tcW w:type="dxa" w:w="3600"/>
+            <w:shd w:fill="0F172A"/>
+            <w:tcMar>
+              <w:top w:w="140" w:type="dxa"/>
+              <w:bottom w:w="180" w:type="dxa"/>
+              <w:left w:w="180" w:type="dxa"/>
+              <w:right w:w="180" w:type="dxa"/>
+            </w:tcMar>
+          </w:tcPr>
           <w:p>
             <w:pPr>
-              <w:spacing w:before="120" w:after="40"/>
+              <w:spacing w:before="0" w:after="40"/>
+            </w:pPr>
+            <w:r>
+              <w:rPr>
+                <w:b/>
+                <w:color w:val="38BDF8"/>
+                <w:sz w:val="18"/>
+              </w:rPr>
+              <w:t>KOA MARIE GERVAIS NELLY</w:t>
+            </w:r>
+          </w:p>
+          <w:p>
+            <w:pPr>
+              <w:spacing w:before="0" w:after="40"/>
+            </w:pPr>
+            <w:r>
+              <w:rPr>
+                <w:color w:val="38BDF8"/>
+                <w:sz w:val="16"/>
+              </w:rPr>
+              <w:t>── ◈ ──</w:t>
+            </w:r>
+          </w:p>
+          <w:p>
+            <w:pPr>
+              <w:spacing w:before="160" w:after="60"/>
+            </w:pPr>
+            <w:r>
+              <w:rPr>
+                <w:rFonts w:ascii="Segoe UI Semibold" w:hAnsi="Segoe UI Semibold"/>
+                <w:b/>
+                <w:color w:val="38BDF8"/>
+                <w:sz w:val="20"/>
+              </w:rPr>
+              <w:t>DISPONIBILITÉ &amp; ENGAGEMENT</w:t>
+            </w:r>
+          </w:p>
+          <w:p>
+            <w:pPr>
+              <w:spacing w:before="0" w:after="50" w:line="276" w:lineRule="auto"/>
+            </w:pPr>
+            <w:r>
+              <w:rPr>
+                <w:color w:val="F8FAFC"/>
+                <w:sz w:val="17"/>
+              </w:rPr>
+              <w:t>◦  Statut : Disponible / Conseil</w:t>
+            </w:r>
+          </w:p>
+          <w:p>
+            <w:pPr>
+              <w:spacing w:before="0" w:after="50" w:line="276" w:lineRule="auto"/>
+            </w:pPr>
+            <w:r>
+              <w:rPr>
+                <w:color w:val="F8FAFC"/>
+                <w:sz w:val="17"/>
+              </w:rPr>
+              <w:t>◦  Mobilité : Internationale / Remote</w:t>
+            </w:r>
+          </w:p>
+          <w:p>
+            <w:pPr>
+              <w:spacing w:before="160" w:after="60"/>
+            </w:pPr>
+            <w:r>
+              <w:rPr>
+                <w:rFonts w:ascii="Segoe UI Semibold" w:hAnsi="Segoe UI Semibold"/>
+                <w:b/>
+                <w:color w:val="38BDF8"/>
+                <w:sz w:val="20"/>
+              </w:rPr>
+              <w:t>RÉFÉRENCES</w:t>
+            </w:r>
+          </w:p>
+          <w:p>
+            <w:pPr>
+              <w:spacing w:before="0" w:after="50" w:line="276" w:lineRule="auto"/>
+            </w:pPr>
+            <w:r>
+              <w:rPr>
+                <w:color w:val="F8FAFC"/>
+                <w:sz w:val="17"/>
+              </w:rPr>
+              <w:t>◈  Disponibles sur demande</w:t>
+            </w:r>
+          </w:p>
+          <w:p>
+            <w:pPr>
+              <w:spacing w:before="0" w:after="50" w:line="276" w:lineRule="auto"/>
+            </w:pPr>
+            <w:r>
+              <w:rPr>
+                <w:color w:val="F8FAFC"/>
+                <w:sz w:val="17"/>
+              </w:rPr>
+              <w:t>◈ ◈ ◈</w:t>
+            </w:r>
+          </w:p>
+        </w:tc>
+        <w:tc>
+          <w:tcPr>
+            <w:tcW w:type="dxa" w:w="7056"/>
+            <w:shd w:fill="FFFFFF"/>
+            <w:tcMar>
+              <w:top w:w="140" w:type="dxa"/>
+              <w:bottom w:w="180" w:type="dxa"/>
+              <w:left w:w="200" w:type="dxa"/>
+              <w:right w:w="180" w:type="dxa"/>
+            </w:tcMar>
+          </w:tcPr>
+          <w:p>
+            <w:pPr>
+              <w:spacing w:before="0" w:after="40"/>
+            </w:pPr>
+          </w:p>
+          <w:p>
+            <w:pPr>
+              <w:spacing w:before="200" w:after="80"/>
             </w:pPr>
             <w:r>
               <w:rPr>
                 <w:b/>
                 <w:color w:val="0284C7"/>
-                <w:sz w:val="18"/>
+                <w:sz w:val="20"/>
               </w:rPr>
               <w:t xml:space="preserve">◈  </w:t>
             </w:r>
@@ -722,20 +833,20 @@
                 <w:rFonts w:ascii="Segoe UI" w:hAnsi="Segoe UI"/>
                 <w:b/>
                 <w:color w:val="0A1128"/>
-                <w:sz w:val="19"/>
+                <w:sz w:val="21"/>
               </w:rPr>
               <w:t>PARCOURS PROFESSIONNEL</w:t>
             </w:r>
           </w:p>
           <w:p>
             <w:pPr>
-              <w:spacing w:before="60" w:after="20"/>
+              <w:spacing w:before="80" w:after="20"/>
             </w:pPr>
             <w:r>
               <w:rPr>
                 <w:b/>
                 <w:color w:val="0A1128"/>
-                <w:sz w:val="18"/>
+                <w:sz w:val="19"/>
               </w:rPr>
               <w:t xml:space="preserve">Consultant IA &amp; Data Science  </w:t>
             </w:r>
@@ -743,28 +854,28 @@
               <w:rPr>
                 <w:i/>
                 <w:color w:val="0284C7"/>
-                <w:sz w:val="16"/>
+                <w:sz w:val="17"/>
               </w:rPr>
-              <w:t>(2025 – Présent)</w:t>
+              <w:t xml:space="preserve">  2025 – Présent</w:t>
+            </w:r>
+          </w:p>
+          <w:p>
+            <w:pPr>
+              <w:spacing w:before="0" w:after="40"/>
+            </w:pPr>
+            <w:r>
+              <w:rPr>
+                <w:b/>
+                <w:color w:val="64748B"/>
+                <w:sz w:val="17"/>
+              </w:rPr>
+              <w:t>Projets Indépendants &amp; Entreprises   │   Douala</w:t>
             </w:r>
           </w:p>
           <w:p>
             <w:pPr>
               <w:spacing w:before="0" w:after="20"/>
-            </w:pPr>
-            <w:r>
-              <w:rPr>
-                <w:b/>
-                <w:color w:val="64748B"/>
-                <w:sz w:val="16"/>
-              </w:rPr>
-              <w:t>Projets Indépendants &amp; Entreprises  │  Douala</w:t>
-            </w:r>
-          </w:p>
-          <w:p>
-            <w:pPr>
-              <w:spacing w:before="0" w:after="20"/>
-              <w:ind w:left="144"/>
+              <w:ind w:left="173"/>
             </w:pPr>
             <w:r>
               <w:rPr>
@@ -776,49 +887,15 @@
             <w:r>
               <w:rPr>
                 <w:color w:val="334155"/>
-                <w:sz w:val="16"/>
+                <w:sz w:val="17"/>
               </w:rPr>
-              <w:t>Analyse exploratoire de données massives, modélisation de graphes de connaissances (Neo4j Cypher), pipelines RAG et bases SQL.</w:t>
-            </w:r>
-          </w:p>
-          <w:p>
-            <w:pPr>
-              <w:spacing w:before="60" w:after="20"/>
-            </w:pPr>
-            <w:r>
-              <w:rPr>
-                <w:b/>
-                <w:color w:val="0A1128"/>
-                <w:sz w:val="18"/>
-              </w:rPr>
-              <w:t xml:space="preserve">Agent de Sûreté Aéroportuaire (AVSEC)  </w:t>
-            </w:r>
-            <w:r>
-              <w:rPr>
-                <w:i/>
-                <w:color w:val="0284C7"/>
-                <w:sz w:val="16"/>
-              </w:rPr>
-              <w:t>(2018 – Présent)</w:t>
+              <w:t>Analyse exploratoire et prétraitement de jeux de données massifs complexes.</w:t>
             </w:r>
           </w:p>
           <w:p>
             <w:pPr>
               <w:spacing w:before="0" w:after="20"/>
-            </w:pPr>
-            <w:r>
-              <w:rPr>
-                <w:b/>
-                <w:color w:val="64748B"/>
-                <w:sz w:val="16"/>
-              </w:rPr>
-              <w:t>CCAA (Autorité Aéronautique du Cameroun)</w:t>
-            </w:r>
-          </w:p>
-          <w:p>
-            <w:pPr>
-              <w:spacing w:before="0" w:after="20"/>
-              <w:ind w:left="144"/>
+              <w:ind w:left="173"/>
             </w:pPr>
             <w:r>
               <w:rPr>
@@ -830,20 +907,114 @@
             <w:r>
               <w:rPr>
                 <w:color w:val="334155"/>
-                <w:sz w:val="16"/>
+                <w:sz w:val="17"/>
               </w:rPr>
-              <w:t>Analyse des risques opérationnels critiques, contrôle d'accès sécurisés et rédaction de rapports d'audit de sûreté.</w:t>
+              <w:t>Modélisation de graphes de connaissances (Neo4j Cypher) et développement de pipelines RAG.</w:t>
             </w:r>
           </w:p>
           <w:p>
             <w:pPr>
-              <w:spacing w:before="120" w:after="40"/>
+              <w:spacing w:before="0" w:after="20"/>
+              <w:ind w:left="173"/>
             </w:pPr>
             <w:r>
               <w:rPr>
                 <w:b/>
                 <w:color w:val="0284C7"/>
-                <w:sz w:val="18"/>
+              </w:rPr>
+              <w:t xml:space="preserve">▸  </w:t>
+            </w:r>
+            <w:r>
+              <w:rPr>
+                <w:color w:val="334155"/>
+                <w:sz w:val="17"/>
+              </w:rPr>
+              <w:t>Conception de bases de données SQL/PostgreSQL et reporting décisionnel interactif.</w:t>
+            </w:r>
+          </w:p>
+          <w:p>
+            <w:pPr>
+              <w:spacing w:before="80" w:after="20"/>
+            </w:pPr>
+            <w:r>
+              <w:rPr>
+                <w:b/>
+                <w:color w:val="0A1128"/>
+                <w:sz w:val="19"/>
+              </w:rPr>
+              <w:t xml:space="preserve">Agent de Sûreté Aéroportuaire (AVSEC)  </w:t>
+            </w:r>
+            <w:r>
+              <w:rPr>
+                <w:i/>
+                <w:color w:val="0284C7"/>
+                <w:sz w:val="17"/>
+              </w:rPr>
+              <w:t xml:space="preserve">  2018 – Présent</w:t>
+            </w:r>
+          </w:p>
+          <w:p>
+            <w:pPr>
+              <w:spacing w:before="0" w:after="40"/>
+            </w:pPr>
+            <w:r>
+              <w:rPr>
+                <w:b/>
+                <w:color w:val="64748B"/>
+                <w:sz w:val="17"/>
+              </w:rPr>
+              <w:t>CCAA (Autorité Aéronautique du Cameroun)</w:t>
+            </w:r>
+          </w:p>
+          <w:p>
+            <w:pPr>
+              <w:spacing w:before="0" w:after="20"/>
+              <w:ind w:left="173"/>
+            </w:pPr>
+            <w:r>
+              <w:rPr>
+                <w:b/>
+                <w:color w:val="0284C7"/>
+              </w:rPr>
+              <w:t xml:space="preserve">▸  </w:t>
+            </w:r>
+            <w:r>
+              <w:rPr>
+                <w:color w:val="334155"/>
+                <w:sz w:val="17"/>
+              </w:rPr>
+              <w:t>Analyse des risques opérationnels critiques et contrôle strict des accès sécurisés.</w:t>
+            </w:r>
+          </w:p>
+          <w:p>
+            <w:pPr>
+              <w:spacing w:before="0" w:after="20"/>
+              <w:ind w:left="173"/>
+            </w:pPr>
+            <w:r>
+              <w:rPr>
+                <w:b/>
+                <w:color w:val="0284C7"/>
+              </w:rPr>
+              <w:t xml:space="preserve">▸  </w:t>
+            </w:r>
+            <w:r>
+              <w:rPr>
+                <w:color w:val="334155"/>
+                <w:sz w:val="17"/>
+              </w:rPr>
+              <w:t>Rédaction de rapports d'audit de sûreté et coordination d'interventions opérationnelles.</w:t>
+            </w:r>
+          </w:p>
+          <w:p>
+            <w:pPr>
+              <w:spacing w:before="200" w:after="80"/>
+            </w:pPr>
+            <w:r>
+              <w:rPr>
+                <w:b/>
+                <w:color w:val="0284C7"/>
+                <w:sz w:val="20"/>
               </w:rPr>
               <w:t xml:space="preserve">◈  </w:t>
             </w:r>
@@ -852,53 +1023,53 @@
                 <w:rFonts w:ascii="Segoe UI" w:hAnsi="Segoe UI"/>
                 <w:b/>
                 <w:color w:val="0A1128"/>
-                <w:sz w:val="19"/>
+                <w:sz w:val="21"/>
               </w:rPr>
               <w:t>FORMATION ACADÉMIQUE</w:t>
             </w:r>
           </w:p>
           <w:p>
             <w:pPr>
-              <w:spacing w:before="40" w:after="20"/>
+              <w:spacing w:before="60" w:after="20"/>
             </w:pPr>
             <w:r>
               <w:rPr>
                 <w:b/>
                 <w:color w:val="0A1128"/>
-                <w:sz w:val="17"/>
+                <w:sz w:val="19"/>
               </w:rPr>
-              <w:t xml:space="preserve">Master 2 IA &amp; Data Science  </w:t>
+              <w:t xml:space="preserve">Master 2 Intelligence Artificielle &amp; Data Science  </w:t>
             </w:r>
             <w:r>
               <w:rPr>
                 <w:i/>
                 <w:color w:val="0284C7"/>
-                <w:sz w:val="16"/>
+                <w:sz w:val="17"/>
               </w:rPr>
-              <w:t>(2025 – 2027)</w:t>
+              <w:t xml:space="preserve">  2025 – 2027</w:t>
             </w:r>
           </w:p>
           <w:p>
             <w:pPr>
-              <w:spacing w:before="0" w:after="20"/>
+              <w:spacing w:before="0" w:after="40"/>
             </w:pPr>
             <w:r>
               <w:rPr>
                 <w:color w:val="64748B"/>
-                <w:sz w:val="16"/>
+                <w:sz w:val="17"/>
               </w:rPr>
-              <w:t>Université de Ngaoundéré  │  Graphes (Neo4j), MLOps &amp; LLM</w:t>
+              <w:t>Université de Ngaoundéré   │   Spécialisation Graphes (Neo4j), MLOps &amp; LLM</w:t>
             </w:r>
           </w:p>
           <w:p>
             <w:pPr>
-              <w:spacing w:before="40" w:after="20"/>
+              <w:spacing w:before="60" w:after="20"/>
             </w:pPr>
             <w:r>
               <w:rPr>
                 <w:b/>
                 <w:color w:val="0A1128"/>
-                <w:sz w:val="17"/>
+                <w:sz w:val="19"/>
               </w:rPr>
               <w:t xml:space="preserve">Licence &amp; BTS Génie Civil (Option Bâtiment)  </w:t>
             </w:r>
@@ -906,21 +1077,34 @@
               <w:rPr>
                 <w:i/>
                 <w:color w:val="0284C7"/>
-                <w:sz w:val="16"/>
+                <w:sz w:val="17"/>
               </w:rPr>
-              <w:t>(2015 – 2016)</w:t>
+              <w:t xml:space="preserve">  2015 – 2016</w:t>
             </w:r>
           </w:p>
           <w:p>
             <w:pPr>
-              <w:spacing w:before="0" w:after="20"/>
+              <w:spacing w:before="0" w:after="40"/>
             </w:pPr>
             <w:r>
               <w:rPr>
                 <w:color w:val="64748B"/>
+                <w:sz w:val="17"/>
+              </w:rPr>
+              <w:t>ISTDI / IUC Douala   │   Dimensionnement BAEL 91 &amp; Métrés BTP</w:t>
+            </w:r>
+          </w:p>
+          <w:p>
+            <w:pPr>
+              <w:spacing w:before="160" w:after="0"/>
+            </w:pPr>
+            <w:r>
+              <w:rPr>
+                <w:i/>
+                <w:color w:val="64748B"/>
                 <w:sz w:val="16"/>
               </w:rPr>
-              <w:t>ISTDI / IUC Douala  │  Dimensionnement BAEL 91 &amp; Métrés BTP</w:t>
+              <w:t>« Motivé, rigoureux et engagé à concevoir des solutions IA souveraines et fiables. »</w:t>
             </w:r>
           </w:p>
         </w:tc>
@@ -928,7 +1112,7 @@
     </w:tbl>
     <w:sectPr>
       <w:pgSz w:w="12240" w:h="15840"/>
-      <w:pgMar w:top="360" w:right="360" w:bottom="360" w:left="360" w:header="720" w:footer="720" w:gutter="0"/>
+      <w:pgMar w:top="432" w:right="432" w:bottom="432" w:left="432" w:header="720" w:footer="720" w:gutter="0"/>
       <w:cols w:space="720"/>
       <w:docGrid w:linePitch="360"/>
     </w:sectPr>
@@ -1301,7 +1485,7 @@
     <w:rsid w:val="00FC693F"/>
     <w:rPr>
       <w:rFonts w:ascii="Segoe UI" w:hAnsi="Segoe UI"/>
-      <w:sz w:val="17"/>
+      <w:sz w:val="18"/>
     </w:rPr>
   </w:style>
   <w:style w:type="paragraph" w:styleId="Header">

</xml_diff>

<commit_message>
feat: Add CVs containing curriculum updates
</commit_message>
<xml_diff>
--- a/KOA_MARIE_GERVAIS_NELLY_CV.docx
+++ b/KOA_MARIE_GERVAIS_NELLY_CV.docx
@@ -552,7 +552,7 @@
                 <w:color w:val="0A1128"/>
                 <w:sz w:val="18"/>
               </w:rPr>
-              <w:t>PROFIL SYNTHÉTIQUE</w:t>
+              <w:t>RÉSUMÉ PROFESSIONNEL</w:t>
             </w:r>
           </w:p>
           <w:p>
@@ -894,6 +894,27 @@
                 <w:color w:val="334155"/>
                 <w:sz w:val="15"/>
               </w:rPr>
+              <w:t>J'accompagne les entreprises dans l'adoption d'IA souveraines dans leurs tâches.</w:t>
+            </w:r>
+          </w:p>
+          <w:p>
+            <w:pPr>
+              <w:spacing w:before="0" w:after="10"/>
+              <w:ind w:left="144"/>
+            </w:pPr>
+            <w:r>
+              <w:rPr>
+                <w:b/>
+                <w:color w:val="0284C7"/>
+                <w:sz w:val="15"/>
+              </w:rPr>
+              <w:t xml:space="preserve">▸  </w:t>
+            </w:r>
+            <w:r>
+              <w:rPr>
+                <w:color w:val="334155"/>
+                <w:sz w:val="15"/>
+              </w:rPr>
               <w:t>Analyse exploratoire et prétraitement de jeux de données massifs complexes.</w:t>
             </w:r>
           </w:p>

</xml_diff>

<commit_message>
feat: Update skills classification, remove project emojis, refine summary text and sync CV documents
</commit_message>
<xml_diff>
--- a/KOA_MARIE_GERVAIS_NELLY_CV.docx
+++ b/KOA_MARIE_GERVAIS_NELLY_CV.docx
@@ -257,7 +257,7 @@
                 <w:color w:val="F8FAFC"/>
                 <w:sz w:val="15"/>
               </w:rPr>
-              <w:t>Neo4j (Cypher, N10S) ■ ■ ■ ■ ■</w:t>
+              <w:t>Neo4j / Cypher      ■ ■ ■ ■ ■</w:t>
             </w:r>
           </w:p>
           <w:p>
@@ -293,7 +293,7 @@
                 <w:color w:val="F8FAFC"/>
                 <w:sz w:val="15"/>
               </w:rPr>
-              <w:t>MLflow (MLOps)     ■ ■ ■ ■ □</w:t>
+              <w:t>Firebase Emulator  ■ ■ ■ ■ □</w:t>
             </w:r>
           </w:p>
           <w:p>
@@ -319,7 +319,7 @@
                 <w:color w:val="38BDF8"/>
                 <w:sz w:val="17"/>
               </w:rPr>
-              <w:t>DEV &amp; BIM</w:t>
+              <w:t>DEV &amp; MLOPS</w:t>
             </w:r>
           </w:p>
           <w:p>
@@ -355,7 +355,7 @@
                 <w:color w:val="F8FAFC"/>
                 <w:sz w:val="15"/>
               </w:rPr>
-              <w:t>Next.js 14 / React ■ ■ ■ ■ □</w:t>
+              <w:t>FastAPI / Next.js  ■ ■ ■ ■ □</w:t>
             </w:r>
           </w:p>
           <w:p>
@@ -367,7 +367,7 @@
                 <w:color w:val="F8FAFC"/>
                 <w:sz w:val="15"/>
               </w:rPr>
-              <w:t>FastAPI / Node     ■ ■ ■ ■ □</w:t>
+              <w:t>MLflow (MLOps)     ■ ■ ■ ■ □</w:t>
             </w:r>
           </w:p>
           <w:p>
@@ -379,19 +379,7 @@
                 <w:color w:val="F8FAFC"/>
                 <w:sz w:val="15"/>
               </w:rPr>
-              <w:t>Streamlit          ■ ■ ■ ■ ■</w:t>
-            </w:r>
-          </w:p>
-          <w:p>
-            <w:pPr>
-              <w:spacing w:before="0" w:after="20" w:line="252" w:lineRule="auto"/>
-            </w:pPr>
-            <w:r>
-              <w:rPr>
-                <w:color w:val="F8FAFC"/>
-                <w:sz w:val="15"/>
-              </w:rPr>
-              <w:t>Docker &amp; Git       ■ ■ ■ ■ □</w:t>
+              <w:t>Streamlit / Docker ■ ■ ■ ■ ■</w:t>
             </w:r>
           </w:p>
           <w:p>
@@ -564,7 +552,7 @@
                 <w:color w:val="334155"/>
                 <w:sz w:val="16"/>
               </w:rPr>
-              <w:t>Consultant IA &amp; Lead AI Engineer, j'accompagne les entreprises dans la transformation de leurs données complexes en leviers décisionnels à forte valeur ajoutée. Spécialiste des Agents IA autonomes, du GraphRAG (Neo4j N10S) et de la Business Intelligence sécurisée (Sovereign.BI), je développe des solutions d'IA souveraines, étanches et explicables (audits SHAP). Fondateur d'Archi Cam AI pour le Google Africa Applied AI Lab, j'allie méthodologie d'ingénieur et vision produit.</w:t>
+              <w:t>Consultant IA &amp; Lead AI Engineer, j'accompagne les entreprises dans la transformation de leurs données complexes en leviers décisionnels à forte valeur ajoutée. Spécialiste des Agents IA autonomes, du GraphRAG et de la Business Intelligence sécurisée, je développe des solutions d'IA souveraines, étanches et explicables. Fondateur d'Archi Cam AI pour le Google Africa Applied AI Lab, j'allie méthodologie d'ingénieur et vision produit.</w:t>
             </w:r>
           </w:p>
           <w:p>
@@ -599,7 +587,7 @@
                 <w:color w:val="0A1128"/>
                 <w:sz w:val="17"/>
               </w:rPr>
-              <w:t xml:space="preserve">Archi Cam AI 🏛️  </w:t>
+              <w:t xml:space="preserve">Archi Cam AI  </w:t>
             </w:r>
             <w:r>
               <w:rPr>
@@ -683,7 +671,7 @@
                 <w:color w:val="0A1128"/>
                 <w:sz w:val="17"/>
               </w:rPr>
-              <w:t xml:space="preserve">Sovereign.BI Agentic 📊  </w:t>
+              <w:t xml:space="preserve">Sovereign.BI Agentic  </w:t>
             </w:r>
             <w:r>
               <w:rPr>
@@ -767,7 +755,7 @@
                 <w:color w:val="0A1128"/>
                 <w:sz w:val="17"/>
               </w:rPr>
-              <w:t xml:space="preserve">Dataset Automator ⚙️ &amp; VigieSahel 🌾  </w:t>
+              <w:t xml:space="preserve">Dataset Automator &amp; VigieSahel  </w:t>
             </w:r>
             <w:r>
               <w:rPr>

</xml_diff>

<commit_message>
feat: Add LinkedIn account to CV page and regenerate CV documents
</commit_message>
<xml_diff>
--- a/KOA_MARIE_GERVAIS_NELLY_CV.docx
+++ b/KOA_MARIE_GERVAIS_NELLY_CV.docx
@@ -158,6 +158,18 @@
                 <w:sz w:val="15"/>
               </w:rPr>
               <w:t>🌐  github.com/gervais-afk</w:t>
+            </w:r>
+          </w:p>
+          <w:p>
+            <w:pPr>
+              <w:spacing w:before="0" w:after="20" w:line="252" w:lineRule="auto"/>
+            </w:pPr>
+            <w:r>
+              <w:rPr>
+                <w:color w:val="F8FAFC"/>
+                <w:sz w:val="15"/>
+              </w:rPr>
+              <w:t>💼  linkedin.com/in/gervais-koa</w:t>
             </w:r>
           </w:p>
           <w:p>

</xml_diff>